<commit_message>
Update API integration system.docx
</commit_message>
<xml_diff>
--- a/Key Documents/API integration system.docx
+++ b/Key Documents/API integration system.docx
@@ -905,13 +905,7 @@
         <w:t xml:space="preserve"> (optional) – TfL’s own journey planner, if used</w:t>
       </w:r>
     </w:p>
-    <w:p>
-      <w:r>
-        <w:pict w14:anchorId="5BD9C43A">
-          <v:rect id="_x0000_i1027" style="width:0;height:1.5pt" o:hralign="center" o:hrstd="t" o:hr="t" fillcolor="#a0a0a0" stroked="f"/>
-        </w:pict>
-      </w:r>
-    </w:p>
+    <w:p/>
     <w:p>
       <w:pPr>
         <w:rPr>
@@ -1161,13 +1155,7 @@
         <w:t>Status data updated periodically (e.g., every 60 seconds).</w:t>
       </w:r>
     </w:p>
-    <w:p>
-      <w:r>
-        <w:pict w14:anchorId="4C49CE45">
-          <v:rect id="_x0000_i1028" style="width:0;height:1.5pt" o:hralign="center" o:hrstd="t" o:hr="t" fillcolor="#a0a0a0" stroked="f"/>
-        </w:pict>
-      </w:r>
-    </w:p>
+    <w:p/>
     <w:p>
       <w:pPr>
         <w:rPr>
@@ -1399,13 +1387,7 @@
         <w:t>Relationship: CONNECTS_TO with properties lineId, direction, baseTravelTime.</w:t>
       </w:r>
     </w:p>
-    <w:p>
-      <w:r>
-        <w:pict w14:anchorId="467B07CE">
-          <v:rect id="_x0000_i1029" style="width:0;height:1.5pt" o:hralign="center" o:hrstd="t" o:hr="t" fillcolor="#a0a0a0" stroked="f"/>
-        </w:pict>
-      </w:r>
-    </w:p>
+    <w:p/>
     <w:p>
       <w:pPr>
         <w:rPr>
@@ -1584,13 +1566,7 @@
         <w:t>These flags inform journey planning in Live mode (e.g., exclude closed/disrupted stations if severity is high).</w:t>
       </w:r>
     </w:p>
-    <w:p>
-      <w:r>
-        <w:pict w14:anchorId="78E74266">
-          <v:rect id="_x0000_i1030" style="width:0;height:1.5pt" o:hralign="center" o:hrstd="t" o:hr="t" fillcolor="#a0a0a0" stroked="f"/>
-        </w:pict>
-      </w:r>
-    </w:p>
+    <w:p/>
     <w:p>
       <w:pPr>
         <w:rPr>
@@ -1670,13 +1646,7 @@
         <w:t>Potential fallback when internal graph is incomplete.</w:t>
       </w:r>
     </w:p>
-    <w:p>
-      <w:r>
-        <w:pict w14:anchorId="5AEB37B7">
-          <v:rect id="_x0000_i1031" style="width:0;height:1.5pt" o:hralign="center" o:hrstd="t" o:hr="t" fillcolor="#a0a0a0" stroked="f"/>
-        </w:pict>
-      </w:r>
-    </w:p>
+    <w:p/>
     <w:p>
       <w:pPr>
         <w:rPr>
@@ -2306,13 +2276,6 @@
       </w:r>
     </w:p>
     <w:p>
-      <w:r>
-        <w:pict w14:anchorId="0B194268">
-          <v:rect id="_x0000_i1033" style="width:0;height:1.5pt" o:hralign="center" o:hrstd="t" o:hr="t" fillcolor="#a0a0a0" stroked="f"/>
-        </w:pict>
-      </w:r>
-    </w:p>
-    <w:p>
       <w:pPr>
         <w:rPr>
           <w:b/>
@@ -2485,13 +2448,7 @@
         <w:t>Caches are used as a fast read layer; DB is the source of truth when caches miss.</w:t>
       </w:r>
     </w:p>
-    <w:p>
-      <w:r>
-        <w:pict w14:anchorId="6315468D">
-          <v:rect id="_x0000_i1034" style="width:0;height:1.5pt" o:hralign="center" o:hrstd="t" o:hr="t" fillcolor="#a0a0a0" stroked="f"/>
-        </w:pict>
-      </w:r>
-    </w:p>
+    <w:p/>
     <w:p>
       <w:pPr>
         <w:rPr>
@@ -2541,7 +2498,6 @@
         </w:numPr>
       </w:pPr>
       <w:r>
-        <w:lastRenderedPageBreak/>
         <w:t>Stored in environment variables or a secure secrets manager.</w:t>
       </w:r>
     </w:p>
@@ -2553,6 +2509,7 @@
         </w:numPr>
       </w:pPr>
       <w:r>
+        <w:lastRenderedPageBreak/>
         <w:t>Not exposed to frontend or client code.</w:t>
       </w:r>
     </w:p>
@@ -2630,13 +2587,7 @@
         <w:t>Only your frontend origin(s) allowed to hit the backend API in production.</w:t>
       </w:r>
     </w:p>
-    <w:p>
-      <w:r>
-        <w:pict w14:anchorId="424086F5">
-          <v:rect id="_x0000_i1035" style="width:0;height:1.5pt" o:hralign="center" o:hrstd="t" o:hr="t" fillcolor="#a0a0a0" stroked="f"/>
-        </w:pict>
-      </w:r>
-    </w:p>
+    <w:p/>
     <w:p>
       <w:pPr>
         <w:rPr>
@@ -2842,13 +2793,7 @@
         <w:t>TFL_REQUEST_TIMEOUT_MS=5000</w:t>
       </w:r>
     </w:p>
-    <w:p>
-      <w:r>
-        <w:pict w14:anchorId="408648E2">
-          <v:rect id="_x0000_i1036" style="width:0;height:1.5pt" o:hralign="center" o:hrstd="t" o:hr="t" fillcolor="#a0a0a0" stroked="f"/>
-        </w:pict>
-      </w:r>
-    </w:p>
+    <w:p/>
     <w:p>
       <w:pPr>
         <w:rPr>
@@ -2903,7 +2848,6 @@
         </w:numPr>
       </w:pPr>
       <w:r>
-        <w:lastRenderedPageBreak/>
         <w:t>Average latency, success/error rates</w:t>
       </w:r>
     </w:p>
@@ -2915,6 +2859,7 @@
         </w:numPr>
       </w:pPr>
       <w:r>
+        <w:lastRenderedPageBreak/>
         <w:t>Cache hit/miss ratios</w:t>
       </w:r>
     </w:p>
@@ -2978,13 +2923,6 @@
       </w:r>
     </w:p>
     <w:p>
-      <w:r>
-        <w:pict w14:anchorId="7AA6E4CF">
-          <v:rect id="_x0000_i1037" style="width:0;height:1.5pt" o:hralign="center" o:hrstd="t" o:hr="t" fillcolor="#a0a0a0" stroked="f"/>
-        </w:pict>
-      </w:r>
-    </w:p>
-    <w:p>
       <w:pPr>
         <w:rPr>
           <w:b/>
@@ -3158,128 +3096,7 @@
         <w:t>Ensure route computation + data fetching meets your latency targets (e.g. &lt; 2s end-to-end for a journey request).</w:t>
       </w:r>
     </w:p>
-    <w:p>
-      <w:r>
-        <w:pict w14:anchorId="6FA4C9D0">
-          <v:rect id="_x0000_i1038" style="width:0;height:1.5pt" o:hralign="center" o:hrstd="t" o:hr="t" fillcolor="#a0a0a0" stroked="f"/>
-        </w:pict>
-      </w:r>
-    </w:p>
-    <w:p>
-      <w:pPr>
-        <w:rPr>
-          <w:b/>
-          <w:bCs/>
-        </w:rPr>
-      </w:pPr>
-      <w:r>
-        <w:rPr>
-          <w:b/>
-          <w:bCs/>
-        </w:rPr>
-        <w:t>12. Assumptions &amp; Open Questions</w:t>
-      </w:r>
-    </w:p>
-    <w:p>
-      <w:pPr>
-        <w:numPr>
-          <w:ilvl w:val="0"/>
-          <w:numId w:val="45"/>
-        </w:numPr>
-      </w:pPr>
-      <w:r>
-        <w:rPr>
-          <w:b/>
-          <w:bCs/>
-        </w:rPr>
-        <w:t>Assumptions</w:t>
-      </w:r>
-    </w:p>
-    <w:p>
-      <w:pPr>
-        <w:numPr>
-          <w:ilvl w:val="1"/>
-          <w:numId w:val="45"/>
-        </w:numPr>
-      </w:pPr>
-      <w:r>
-        <w:t>TfL Unified API is stable and accessible from the deployed environment.</w:t>
-      </w:r>
-    </w:p>
-    <w:p>
-      <w:pPr>
-        <w:numPr>
-          <w:ilvl w:val="1"/>
-          <w:numId w:val="45"/>
-        </w:numPr>
-      </w:pPr>
-      <w:r>
-        <w:t>Line topology does not change frequently; daily refresh is sufficient.</w:t>
-      </w:r>
-    </w:p>
-    <w:p>
-      <w:pPr>
-        <w:numPr>
-          <w:ilvl w:val="1"/>
-          <w:numId w:val="45"/>
-        </w:numPr>
-      </w:pPr>
-      <w:r>
-        <w:t>Rate limits are manageable with caching.</w:t>
-      </w:r>
-    </w:p>
-    <w:p>
-      <w:pPr>
-        <w:numPr>
-          <w:ilvl w:val="0"/>
-          <w:numId w:val="45"/>
-        </w:numPr>
-      </w:pPr>
-      <w:r>
-        <w:rPr>
-          <w:b/>
-          <w:bCs/>
-        </w:rPr>
-        <w:t>Open Questions</w:t>
-      </w:r>
-      <w:r>
-        <w:t xml:space="preserve"> (you can tailor for your report)</w:t>
-      </w:r>
-    </w:p>
-    <w:p>
-      <w:pPr>
-        <w:numPr>
-          <w:ilvl w:val="1"/>
-          <w:numId w:val="45"/>
-        </w:numPr>
-      </w:pPr>
-      <w:r>
-        <w:t>Will we use TfL Journey Planner as a fallback or rely entirely on our own routing?</w:t>
-      </w:r>
-    </w:p>
-    <w:p>
-      <w:pPr>
-        <w:numPr>
-          <w:ilvl w:val="1"/>
-          <w:numId w:val="45"/>
-        </w:numPr>
-      </w:pPr>
-      <w:r>
-        <w:lastRenderedPageBreak/>
-        <w:t>How often should we refresh disruptions vs line status vs topology in production?</w:t>
-      </w:r>
-    </w:p>
-    <w:p>
-      <w:pPr>
-        <w:numPr>
-          <w:ilvl w:val="1"/>
-          <w:numId w:val="45"/>
-        </w:numPr>
-      </w:pPr>
-      <w:r>
-        <w:t>Do we need WebSocket-based live updates (e.g. for arrivals), or is polling enough?</w:t>
-      </w:r>
-    </w:p>
+    <w:p/>
     <w:p/>
     <w:sectPr>
       <w:pgSz w:w="11906" w:h="16838"/>
@@ -10791,6 +10608,7 @@
   <w:style w:type="character" w:default="1" w:styleId="DefaultParagraphFont">
     <w:name w:val="Default Paragraph Font"/>
     <w:uiPriority w:val="1"/>
+    <w:semiHidden/>
     <w:unhideWhenUsed/>
   </w:style>
   <w:style w:type="table" w:default="1" w:styleId="TableNormal">

</xml_diff>